<commit_message>
chore: sync local changes [2026-05-11 10:43]
</commit_message>
<xml_diff>
--- a/document/softwarex_draft.docx
+++ b/document/softwarex_draft.docx
@@ -299,13 +299,25 @@
         <w:t xml:space="preserve"> </w:t>
       </w:r>
       <w:r>
-        <w:t xml:space="preserve">scaling.</w:t>
-      </w:r>
-      <w:r>
-        <w:t xml:space="preserve"> </w:t>
-      </w:r>
-      <w:r>
-        <w:t xml:space="preserve">NumPy</w:t>
+        <w:t xml:space="preserve">scaling,</w:t>
+      </w:r>
+      <w:r>
+        <w:t xml:space="preserve"> </w:t>
+      </w:r>
+      <w:r>
+        <w:t xml:space="preserve">for</w:t>
+      </w:r>
+      <w:r>
+        <w:t xml:space="preserve"> </w:t>
+      </w:r>
+      <w:r>
+        <w:t xml:space="preserve">example,</w:t>
+      </w:r>
+      <w:r>
+        <w:t xml:space="preserve"> </w:t>
+      </w:r>
+      <w:r>
+        <w:t xml:space="preserve">numpy</w:t>
       </w:r>
       <w:r>
         <w:t xml:space="preserve"> </w:t>
@@ -330,6 +342,21 @@
       </w:r>
       <w:r>
         <w:t xml:space="preserve">transform</w:t>
+      </w:r>
+      <w:r>
+        <w:t xml:space="preserve"> </w:t>
+      </w:r>
+      <w:r>
+        <w:t xml:space="preserve">(</w:t>
+      </w:r>
+      <w:r>
+        <w:rPr>
+          <w:rStyle w:val="VerbatimChar"/>
+        </w:rPr>
+        <w:t xml:space="preserve">ifft()</w:t>
+      </w:r>
+      <w:r>
+        <w:t xml:space="preserve">)</w:t>
       </w:r>
       <w:r>
         <w:t xml:space="preserve"> </w:t>
@@ -784,7 +811,43 @@
         </m:r>
       </m:oMath>
       <w:r>
-        <w:t xml:space="preserve">.</w:t>
+        <w:t xml:space="preserve">,</w:t>
+      </w:r>
+      <w:r>
+        <w:t xml:space="preserve"> </w:t>
+      </w:r>
+      <w:r>
+        <w:t xml:space="preserve">which</w:t>
+      </w:r>
+      <w:r>
+        <w:t xml:space="preserve"> </w:t>
+      </w:r>
+      <w:r>
+        <w:t xml:space="preserve">leads</w:t>
+      </w:r>
+      <w:r>
+        <w:t xml:space="preserve"> </w:t>
+      </w:r>
+      <w:r>
+        <w:t xml:space="preserve">to</w:t>
+      </w:r>
+      <w:r>
+        <w:t xml:space="preserve"> </w:t>
+      </w:r>
+      <w:r>
+        <w:t xml:space="preserve">incorrect</w:t>
+      </w:r>
+      <w:r>
+        <w:t xml:space="preserve"> </w:t>
+      </w:r>
+      <w:r>
+        <w:t xml:space="preserve">physical</w:t>
+      </w:r>
+      <w:r>
+        <w:t xml:space="preserve"> </w:t>
+      </w:r>
+      <w:r>
+        <w:t xml:space="preserve">interpretations.</w:t>
       </w:r>
       <w:r>
         <w:t xml:space="preserve"> </w:t>
@@ -1137,6 +1200,12 @@
         <w:t xml:space="preserve"> </w:t>
       </w:r>
       <w:r>
+        <w:t xml:space="preserve">made</w:t>
+      </w:r>
+      <w:r>
+        <w:t xml:space="preserve"> </w:t>
+      </w:r>
+      <w:r>
         <w:t xml:space="preserve">open-source</w:t>
       </w:r>
       <w:r>
@@ -1554,15 +1623,21 @@
         <w:t xml:space="preserve"> </w:t>
       </w:r>
       <m:oMath>
-        <m:r>
-          <m:t>1</m:t>
-        </m:r>
-        <m:r>
-          <m:t>/</m:t>
-        </m:r>
-        <m:r>
-          <m:t>N</m:t>
-        </m:r>
+        <m:f>
+          <m:fPr>
+            <m:type m:val="bar"/>
+          </m:fPr>
+          <m:num>
+            <m:r>
+              <m:t>1</m:t>
+            </m:r>
+          </m:num>
+          <m:den>
+            <m:r>
+              <m:t>N</m:t>
+            </m:r>
+          </m:den>
+        </m:f>
       </m:oMath>
       <w:r>
         <w:t xml:space="preserve"> </w:t>
@@ -1608,7 +1683,19 @@
         <w:t xml:space="preserve"> </w:t>
       </w:r>
       <w:r>
-        <w:t xml:space="preserve">silently to one choice from this family.</w:t>
+        <w:t xml:space="preserve">to one choice from this family. While the choice is made open by the library’s documentation,</w:t>
+      </w:r>
+      <w:r>
+        <w:t xml:space="preserve"> </w:t>
+      </w:r>
+      <w:r>
+        <w:t xml:space="preserve">but if the user does not read the documentation carefully, they may inadvertently use the</w:t>
+      </w:r>
+      <w:r>
+        <w:t xml:space="preserve"> </w:t>
+      </w:r>
+      <w:r>
+        <w:t xml:space="preserve">wrong convention, that leads to incorrect physical interpretations.</w:t>
       </w:r>
     </w:p>
     <w:p>
@@ -1668,7 +1755,13 @@
         <w:t xml:space="preserve"> </w:t>
       </w:r>
       <w:r>
-        <w:t xml:space="preserve">single transforms. The inverse DFT of a brick-wall low-pass transfer function</w:t>
+        <w:t xml:space="preserve">single transforms, if the user is interfacing with the different tools/libraries/languages</w:t>
+      </w:r>
+      <w:r>
+        <w:t xml:space="preserve"> </w:t>
+      </w:r>
+      <w:r>
+        <w:t xml:space="preserve">for a round-trip calculation. The inverse DFT of a brick-wall low-pass transfer function</w:t>
       </w:r>
       <w:r>
         <w:t xml:space="preserve"> </w:t>
@@ -1688,7 +1781,7 @@
         <w:t xml:space="preserve"> </w:t>
       </w:r>
       <w:r>
-        <w:t xml:space="preserve">— a consequence of the filter passing DC with unit gain. With NumPy’s convention</w:t>
+        <w:t xml:space="preserve">— a consequence of the filter passing DC with unit gain. With Python’s NumPy convention</w:t>
       </w:r>
       <w:r>
         <w:t xml:space="preserve"> </w:t>
@@ -1700,18 +1793,24 @@
         <w:t xml:space="preserve"> </w:t>
       </w:r>
       <m:oMath>
-        <m:r>
-          <m:t>1</m:t>
-        </m:r>
-        <m:r>
-          <m:t>/</m:t>
-        </m:r>
-        <m:r>
-          <m:t>Δ</m:t>
-        </m:r>
-        <m:r>
-          <m:t>t</m:t>
-        </m:r>
+        <m:f>
+          <m:fPr>
+            <m:type m:val="bar"/>
+          </m:fPr>
+          <m:num>
+            <m:r>
+              <m:t>1</m:t>
+            </m:r>
+          </m:num>
+          <m:den>
+            <m:r>
+              <m:t>Δ</m:t>
+            </m:r>
+            <m:r>
+              <m:t>t</m:t>
+            </m:r>
+          </m:den>
+        </m:f>
       </m:oMath>
       <w:r>
         <w:t xml:space="preserve">; with R’s it is</w:t>
@@ -1720,18 +1819,24 @@
         <w:t xml:space="preserve"> </w:t>
       </w:r>
       <m:oMath>
-        <m:r>
-          <m:t>N</m:t>
-        </m:r>
-        <m:r>
-          <m:t>/</m:t>
-        </m:r>
-        <m:r>
-          <m:t>Δ</m:t>
-        </m:r>
-        <m:r>
-          <m:t>t</m:t>
-        </m:r>
+        <m:f>
+          <m:fPr>
+            <m:type m:val="bar"/>
+          </m:fPr>
+          <m:num>
+            <m:r>
+              <m:t>N</m:t>
+            </m:r>
+          </m:num>
+          <m:den>
+            <m:r>
+              <m:t>Δ</m:t>
+            </m:r>
+            <m:r>
+              <m:t>t</m:t>
+            </m:r>
+          </m:den>
+        </m:f>
       </m:oMath>
       <w:r>
         <w:t xml:space="preserve">. Neither</w:t>
@@ -1910,15 +2015,21 @@
               <w:jc w:val="center"/>
             </w:pPr>
             <m:oMath>
-              <m:r>
-                <m:t>1</m:t>
-              </m:r>
-              <m:r>
-                <m:t>/</m:t>
-              </m:r>
-              <m:r>
-                <m:t>N</m:t>
-              </m:r>
+              <m:f>
+                <m:fPr>
+                  <m:type m:val="bar"/>
+                </m:fPr>
+                <m:num>
+                  <m:r>
+                    <m:t>1</m:t>
+                  </m:r>
+                </m:num>
+                <m:den>
+                  <m:r>
+                    <m:t>N</m:t>
+                  </m:r>
+                </m:den>
+              </m:f>
             </m:oMath>
           </w:p>
         </w:tc>
@@ -1979,15 +2090,21 @@
               <w:jc w:val="center"/>
             </w:pPr>
             <m:oMath>
-              <m:r>
-                <m:t>1</m:t>
-              </m:r>
-              <m:r>
-                <m:t>/</m:t>
-              </m:r>
-              <m:r>
-                <m:t>N</m:t>
-              </m:r>
+              <m:f>
+                <m:fPr>
+                  <m:type m:val="bar"/>
+                </m:fPr>
+                <m:num>
+                  <m:r>
+                    <m:t>1</m:t>
+                  </m:r>
+                </m:num>
+                <m:den>
+                  <m:r>
+                    <m:t>N</m:t>
+                  </m:r>
+                </m:den>
+              </m:f>
             </m:oMath>
           </w:p>
         </w:tc>
@@ -2137,15 +2254,21 @@
               <w:jc w:val="center"/>
             </w:pPr>
             <m:oMath>
-              <m:r>
-                <m:t>1</m:t>
-              </m:r>
-              <m:r>
-                <m:t>/</m:t>
-              </m:r>
-              <m:r>
-                <m:t>N</m:t>
-              </m:r>
+              <m:f>
+                <m:fPr>
+                  <m:type m:val="bar"/>
+                </m:fPr>
+                <m:num>
+                  <m:r>
+                    <m:t>1</m:t>
+                  </m:r>
+                </m:num>
+                <m:den>
+                  <m:r>
+                    <m:t>N</m:t>
+                  </m:r>
+                </m:den>
+              </m:f>
             </m:oMath>
           </w:p>
         </w:tc>
@@ -2224,7 +2347,7 @@
         <w:t xml:space="preserve"> </w:t>
       </w:r>
       <w:r>
-        <w:t xml:space="preserve">factor in Parseval’s theorem), he derived two distinct DFT</w:t>
+        <w:t xml:space="preserve">factor in Parseval’s theorem), study derived two distinct DFT</w:t>
       </w:r>
       <w:r>
         <w:t xml:space="preserve"> </w:t>
@@ -2371,27 +2494,27 @@
         <m:r>
           <m:t>=</m:t>
         </m:r>
-        <m:r>
-          <m:t>1</m:t>
-        </m:r>
-        <m:r>
-          <m:t>/</m:t>
-        </m:r>
-        <m:r>
-          <m:t>(</m:t>
-        </m:r>
-        <m:r>
-          <m:t>N</m:t>
-        </m:r>
-        <m:r>
-          <m:t>Δ</m:t>
-        </m:r>
-        <m:r>
-          <m:t>t</m:t>
-        </m:r>
-        <m:r>
-          <m:t>)</m:t>
-        </m:r>
+        <m:f>
+          <m:fPr>
+            <m:type m:val="bar"/>
+          </m:fPr>
+          <m:num>
+            <m:r>
+              <m:t>1</m:t>
+            </m:r>
+          </m:num>
+          <m:den>
+            <m:r>
+              <m:t>N</m:t>
+            </m:r>
+            <m:r>
+              <m:t>Δ</m:t>
+            </m:r>
+            <m:r>
+              <m:t>t</m:t>
+            </m:r>
+          </m:den>
+        </m:f>
       </m:oMath>
       <w:r>
         <w:t xml:space="preserve">. This pair is the correct choice when recovering</w:t>
@@ -2596,13 +2719,13 @@
         <w:rPr>
           <w:i/>
         </w:rPr>
-        <w:t xml:space="preserve">theory</w:t>
-      </w:r>
-      <w:r>
-        <w:t xml:space="preserve"> </w:t>
-      </w:r>
-      <w:r>
-        <w:t xml:space="preserve">paper. It stops at the equations and explicitly</w:t>
+        <w:t xml:space="preserve">theoritical</w:t>
+      </w:r>
+      <w:r>
+        <w:t xml:space="preserve"> </w:t>
+      </w:r>
+      <w:r>
+        <w:t xml:space="preserve">study. It stops at the equations and explicitly</w:t>
       </w:r>
       <w:r>
         <w:t xml:space="preserve"> </w:t>
@@ -2620,7 +2743,7 @@
         <w:t xml:space="preserve"> </w:t>
       </w:r>
       <w:r>
-        <w:t xml:space="preserve">environments — Python, MATLAB, Fortran, Julia, R, and others — have been left</w:t>
+        <w:t xml:space="preserve">environments — Python, MATLAB, Fortran, Julia, R, and many others — have been left</w:t>
       </w:r>
       <w:r>
         <w:t xml:space="preserve"> </w:t>
@@ -2758,27 +2881,27 @@
         <m:r>
           <m:t>=</m:t>
         </m:r>
-        <m:r>
-          <m:t>1</m:t>
-        </m:r>
-        <m:r>
-          <m:t>/</m:t>
-        </m:r>
-        <m:r>
-          <m:t>(</m:t>
-        </m:r>
-        <m:r>
-          <m:t>N</m:t>
-        </m:r>
-        <m:r>
-          <m:t>Δ</m:t>
-        </m:r>
-        <m:r>
-          <m:t>t</m:t>
-        </m:r>
-        <m:r>
-          <m:t>)</m:t>
-        </m:r>
+        <m:f>
+          <m:fPr>
+            <m:type m:val="bar"/>
+          </m:fPr>
+          <m:num>
+            <m:r>
+              <m:t>1</m:t>
+            </m:r>
+          </m:num>
+          <m:den>
+            <m:r>
+              <m:t>N</m:t>
+            </m:r>
+            <m:r>
+              <m:t>Δ</m:t>
+            </m:r>
+            <m:r>
+              <m:t>t</m:t>
+            </m:r>
+          </m:den>
+        </m:f>
       </m:oMath>
       <w:r>
         <w:t xml:space="preserve"> </w:t>
@@ -3393,15 +3516,21 @@
         <m:r>
           <m:t>=</m:t>
         </m:r>
-        <m:r>
-          <m:t>1</m:t>
-        </m:r>
-        <m:r>
-          <m:t>/</m:t>
-        </m:r>
-        <m:r>
-          <m:t>N</m:t>
-        </m:r>
+        <m:f>
+          <m:fPr>
+            <m:type m:val="bar"/>
+          </m:fPr>
+          <m:num>
+            <m:r>
+              <m:t>1</m:t>
+            </m:r>
+          </m:num>
+          <m:den>
+            <m:r>
+              <m:t>N</m:t>
+            </m:r>
+          </m:den>
+        </m:f>
       </m:oMath>
       <w:r>
         <w:t xml:space="preserve"> </w:t>
@@ -3600,15 +3729,21 @@
               <m:r>
                 <m:t>=</m:t>
               </m:r>
-              <m:r>
-                <m:t>1</m:t>
-              </m:r>
-              <m:r>
-                <m:t>/</m:t>
-              </m:r>
-              <m:r>
-                <m:t>N</m:t>
-              </m:r>
+              <m:f>
+                <m:fPr>
+                  <m:type m:val="bar"/>
+                </m:fPr>
+                <m:num>
+                  <m:r>
+                    <m:t>1</m:t>
+                  </m:r>
+                </m:num>
+                <m:den>
+                  <m:r>
+                    <m:t>N</m:t>
+                  </m:r>
+                </m:den>
+              </m:f>
             </m:oMath>
             <w:r>
               <w:t xml:space="preserve"> </w:t>
@@ -3704,15 +3839,21 @@
               <m:r>
                 <m:t>=</m:t>
               </m:r>
-              <m:r>
-                <m:t>A</m:t>
-              </m:r>
-              <m:r>
-                <m:t>/</m:t>
-              </m:r>
-              <m:r>
-                <m:t>2</m:t>
-              </m:r>
+              <m:f>
+                <m:fPr>
+                  <m:type m:val="bar"/>
+                </m:fPr>
+                <m:num>
+                  <m:r>
+                    <m:t>A</m:t>
+                  </m:r>
+                </m:num>
+                <m:den>
+                  <m:r>
+                    <m:t>2</m:t>
+                  </m:r>
+                </m:den>
+              </m:f>
             </m:oMath>
           </w:p>
         </w:tc>
@@ -3997,7 +4138,19 @@
         <w:t xml:space="preserve"> </w:t>
       </w:r>
       <w:r>
-        <w:t xml:space="preserve">only the import statement; the transform calls remain unchanged.</w:t>
+        <w:t xml:space="preserve">only the import statement; the transform calls remain unchanged. Addiionally, for cases where user needs</w:t>
+      </w:r>
+      <w:r>
+        <w:t xml:space="preserve"> </w:t>
+      </w:r>
+      <w:r>
+        <w:t xml:space="preserve">to switch between different languages while computing, the same API can be used and without worrying about</w:t>
+      </w:r>
+      <w:r>
+        <w:t xml:space="preserve"> </w:t>
+      </w:r>
+      <w:r>
+        <w:t xml:space="preserve">the underlying implementation details.</w:t>
       </w:r>
     </w:p>
     <w:p>
@@ -4189,12 +4342,21 @@
               <w:jc w:val="center"/>
             </w:pPr>
             <m:oMath>
-              <m:r>
-                <m:t>/</m:t>
-              </m:r>
-              <m:r>
-                <m:t>N</m:t>
-              </m:r>
+              <m:f>
+                <m:fPr>
+                  <m:type m:val="bar"/>
+                </m:fPr>
+                <m:num>
+                  <m:r>
+                    <m:t>1</m:t>
+                  </m:r>
+                </m:num>
+                <m:den>
+                  <m:r>
+                    <m:t>N</m:t>
+                  </m:r>
+                </m:den>
+              </m:f>
             </m:oMath>
           </w:p>
         </w:tc>
@@ -4248,12 +4410,21 @@
               <w:jc w:val="center"/>
             </w:pPr>
             <m:oMath>
-              <m:r>
-                <m:t>/</m:t>
-              </m:r>
-              <m:r>
-                <m:t>N</m:t>
-              </m:r>
+              <m:f>
+                <m:fPr>
+                  <m:type m:val="bar"/>
+                </m:fPr>
+                <m:num>
+                  <m:r>
+                    <m:t>1</m:t>
+                  </m:r>
+                </m:num>
+                <m:den>
+                  <m:r>
+                    <m:t>N</m:t>
+                  </m:r>
+                </m:den>
+              </m:f>
             </m:oMath>
           </w:p>
         </w:tc>
@@ -4307,12 +4478,21 @@
               <w:jc w:val="center"/>
             </w:pPr>
             <m:oMath>
-              <m:r>
-                <m:t>/</m:t>
-              </m:r>
-              <m:r>
-                <m:t>N</m:t>
-              </m:r>
+              <m:f>
+                <m:fPr>
+                  <m:type m:val="bar"/>
+                </m:fPr>
+                <m:num>
+                  <m:r>
+                    <m:t>1</m:t>
+                  </m:r>
+                </m:num>
+                <m:den>
+                  <m:r>
+                    <m:t>N</m:t>
+                  </m:r>
+                </m:den>
+              </m:f>
             </m:oMath>
           </w:p>
         </w:tc>
@@ -4378,12 +4558,21 @@
               <w:jc w:val="center"/>
             </w:pPr>
             <m:oMath>
-              <m:r>
-                <m:t>/</m:t>
-              </m:r>
-              <m:r>
-                <m:t>N</m:t>
-              </m:r>
+              <m:f>
+                <m:fPr>
+                  <m:type m:val="bar"/>
+                </m:fPr>
+                <m:num>
+                  <m:r>
+                    <m:t>1</m:t>
+                  </m:r>
+                </m:num>
+                <m:den>
+                  <m:r>
+                    <m:t>N</m:t>
+                  </m:r>
+                </m:den>
+              </m:f>
             </m:oMath>
           </w:p>
         </w:tc>
@@ -4422,15 +4611,21 @@
               <w:t xml:space="preserve"> </w:t>
             </w:r>
             <m:oMath>
-              <m:r>
-                <m:t>1</m:t>
-              </m:r>
-              <m:r>
-                <m:t>/</m:t>
-              </m:r>
-              <m:r>
-                <m:t>N</m:t>
-              </m:r>
+              <m:f>
+                <m:fPr>
+                  <m:type m:val="bar"/>
+                </m:fPr>
+                <m:num>
+                  <m:r>
+                    <m:t>1</m:t>
+                  </m:r>
+                </m:num>
+                <m:den>
+                  <m:r>
+                    <m:t>N</m:t>
+                  </m:r>
+                </m:den>
+              </m:f>
             </m:oMath>
             <w:r>
               <w:t xml:space="preserve">)</w:t>
@@ -4502,15 +4697,21 @@
               <w:jc w:val="center"/>
             </w:pPr>
             <m:oMath>
-              <m:r>
-                <m:t>1</m:t>
-              </m:r>
-              <m:r>
-                <m:t>/</m:t>
-              </m:r>
-              <m:r>
-                <m:t>N</m:t>
-              </m:r>
+              <m:f>
+                <m:fPr>
+                  <m:type m:val="bar"/>
+                </m:fPr>
+                <m:num>
+                  <m:r>
+                    <m:t>1</m:t>
+                  </m:r>
+                </m:num>
+                <m:den>
+                  <m:r>
+                    <m:t>N</m:t>
+                  </m:r>
+                </m:den>
+              </m:f>
             </m:oMath>
             <w:r>
               <w:t xml:space="preserve"> </w:t>
@@ -5915,26 +6116,6 @@
     <w:p>
       <w:pPr>
         <w:pStyle w:val="FirstParagraph"/>
-      </w:pPr>
-      <w:r>
-        <w:t xml:space="preserve">The author thanks David H. Boteler (Natural Resources Canada) for the foundational</w:t>
-      </w:r>
-      <w:r>
-        <w:t xml:space="preserve"> </w:t>
-      </w:r>
-      <w:r>
-        <w:t xml:space="preserve">mathematical conventions implemented here and for encouraging the development of a</w:t>
-      </w:r>
-      <w:r>
-        <w:t xml:space="preserve"> </w:t>
-      </w:r>
-      <w:r>
-        <w:t xml:space="preserve">dedicated software companion to Boteler (2012).</w:t>
-      </w:r>
-    </w:p>
-    <w:p>
-      <w:pPr>
-        <w:pStyle w:val="BodyText"/>
       </w:pPr>
       <w:r>
         <w:t xml:space="preserve">9</w:t>

</xml_diff>